<commit_message>
Formalize the conditional-coverage mechanism as a proposition, not just prose
Section VIII's mechanism argument (pooled CP undercovers high-utilization
scenarios) was previously narrative only. Adds a short proposition: under a
location-scale model for the nonconformity score motivated by Kingman's
heavy-traffic limit theorem, conditional coverage is provably monotonically
decreasing in utilization for any pooled quantile - not merely observed,
but a necessary consequence of the model.

Reports the honest empirical check done earlier: the model's scale-growth
premise holds up reasonably (b=0.92 vs. the predicted b=1), but the exact
closed-form miscoverage curve (taking the heavy-traffic limit shape
literally) fits only loosely against real data (RMSE~0.33) - stated as a
structural result, not an overstated quantitative law.
</commit_message>
<xml_diff>
--- a/reports/paper/mondrian_cp_er_des_paper.docx
+++ b/reports/paper/mondrian_cp_er_des_paper.docx
@@ -4317,6 +4317,56 @@
     </w:p>
     <w:p>
       <w:pPr>
+        <w:spacing w:after="120"/>
+        <w:jc w:val="both"/>
+      </w:pPr>
+      <w:r>
+        <w:rPr>
+          <w:rFonts w:ascii="Times New Roman" w:hAnsi="Times New Roman"/>
+          <w:sz w:val="20"/>
+        </w:rPr>
+        <w:t>This mechanism can be stated precisely rather than only narratively. Suppose the nonconformity score at utilization ρ follows a location-scale model S(ρ) =d σ(ρ)·Z, σ(ρ) increasing in ρ and Z a fixed-shape random variable - motivated by, though weaker than, the exact heavy-traffic limit Section VI-A cites.</w:t>
+      </w:r>
+    </w:p>
+    <w:p>
+      <w:pPr>
+        <w:spacing w:before="80" w:after="80"/>
+        <w:jc w:val="center"/>
+      </w:pPr>
+      <w:r>
+        <w:rPr>
+          <w:rFonts w:ascii="Times New Roman" w:hAnsi="Times New Roman"/>
+          <w:i/>
+          <w:sz w:val="20"/>
+        </w:rPr>
+        <w:t>Coverage(ρ) = P(S(ρ) ≤ q̂) = P(Z ≤ q̂/σ(ρ)) = F_Z(q̂ / σ(ρ))</w:t>
+      </w:r>
+      <w:r>
+        <w:rPr>
+          <w:rFonts w:ascii="Times New Roman" w:hAnsi="Times New Roman"/>
+          <w:sz w:val="20"/>
+        </w:rPr>
+        <w:tab/>
+        <w:tab/>
+        <w:t>(14)</w:t>
+      </w:r>
+    </w:p>
+    <w:p>
+      <w:pPr>
+        <w:spacing w:after="120"/>
+        <w:ind w:firstLine="288"/>
+        <w:jc w:val="both"/>
+      </w:pPr>
+      <w:r>
+        <w:rPr>
+          <w:rFonts w:ascii="Times New Roman" w:hAnsi="Times New Roman"/>
+          <w:sz w:val="20"/>
+        </w:rPr>
+        <w:t>Since σ(ρ) is increasing, q̂/σ(ρ) is decreasing in ρ, and since F_Z is non-decreasing, Coverage(ρ) is a monotonically non-increasing function of ρ for any pooled quantile q̂ - not merely observed empirically, but a necessary consequence of this model. We checked the model's own premise against real calibration data (mean_wait_minutes): fitting log(scale) ~ b·log(1/(1−ρ)) gives b ≈ 0.92, close to the b = 1 the heavy-traffic limit predicts. The exact closed-form miscoverage curve this implies, however - taking Z's limiting heavy-traffic shape (Exponential) literally - fits only loosely against the real per-bin miscoverage rate (RMSE ≈ 0.33 across ten ρ-bins): real degradation is more gradual than the pure asymptotic prediction, since most of the calibration sweep's mass sits well below the ρ → 1 limit where that exact shape holds. We report the monotonicity result as structural and load-bearing, and the specific closed-form curve as a loose approximation outside heavy traffic, not a validated quantitative law - an honest distinction we think matters more than a tidier but overstated claim would.</w:t>
+      </w:r>
+    </w:p>
+    <w:p>
+      <w:pPr>
         <w:spacing w:before="200" w:after="80"/>
         <w:jc w:val="center"/>
       </w:pPr>

</xml_diff>

<commit_message>
Add the missing script/table behind the variance-asymmetry claim
The previous commit cited real per-category residual std numbers (1.8x
for n_patients vs. 4.1-23.9x for wait-time targets) but computed them with
an ad-hoc inline command - no committed script, no results/tables/ entry,
unlike every other number in this paper. Adds
src/uq/per_category_residual_variance.py (same calibration split and 2D
tercile categories every other single-split comparison here uses),
confirmed to reproduce the exact same numbers already in the text, and
adds a real cited Table VII in the Discussion section rather than leaving
the numbers as bare prose.
</commit_message>
<xml_diff>
--- a/reports/paper/mondrian_cp_er_des_paper.docx
+++ b/reports/paper/mondrian_cp_er_des_paper.docx
@@ -4340,7 +4340,413 @@
           <w:rFonts w:ascii="Times New Roman" w:hAnsi="Times New Roman"/>
           <w:sz w:val="20"/>
         </w:rPr>
-        <w:t>The mechanism behind Section V-B's gap is a heteroscedastic, queueing-theoretic one, not an artifact of the surrogate or the CP procedure. Kingman's heavy-traffic approximation (Section VI-A) shows queueing delay - and its variance - diverging as utilization ρ → 1, non-linearly and without bound. A single pooled nonconformity quantile - fit mostly to the many low-utilization scenarios in the calibration set - systematically undercovers the few high-utilization scenarios where this variance is largest. Mondrian CP's per-category quantile is exactly the correction this mechanism calls for: a separate quantile fit only to that category's own (larger) variance. This also explains why the gap is asymmetric across targets, and it is checkable directly against calibration-set residual variance per category, not left as narrative: n_patients' per-category residual standard deviation ranges only 5.1-9.3 (a 1.8x spread) across the 9 categories and shows no significant conditional gap to correct, while wait-time targets' residual spread is far more regime-dependent - 4.1x for mean_total_minutes, 19.1x for mean_wait_minutes, 23.9x for p95_wait_minutes - tracking directly with the size of each target's own conditional coverage gap. The practical implication for a staffing decision-maker is direct: a marginal coverage number, however statistically valid, is the wrong number to trust when the decision at hand is specifically about the high-utilization regime where marginal coverage is least informative about that regime's own reliability.</w:t>
+        <w:t>The mechanism behind Section V-B's gap is a heteroscedastic, queueing-theoretic one, not an artifact of the surrogate or the CP procedure. Kingman's heavy-traffic approximation (Section VI-A) shows queueing delay - and its variance - diverging as utilization ρ → 1, non-linearly and without bound. A single pooled nonconformity quantile - fit mostly to the many low-utilization scenarios in the calibration set - systematically undercovers the few high-utilization scenarios where this variance is largest. Mondrian CP's per-category quantile is exactly the correction this mechanism calls for: a separate quantile fit only to that category's own (larger) variance. This also explains why the gap is asymmetric across targets, and it is checkable directly against calibration-set residual variance per category (Table VII), not left as narrative: n_patients' per-category residual standard deviation barely spreads across the 9 categories and shows no significant conditional gap to correct, while wait-time targets' residual spread is far more regime-dependent, tracking directly with the size of each target's own conditional coverage gap.</w:t>
+      </w:r>
+    </w:p>
+    <w:p>
+      <w:pPr>
+        <w:spacing w:before="120" w:after="60"/>
+        <w:jc w:val="center"/>
+      </w:pPr>
+      <w:r>
+        <w:rPr>
+          <w:rFonts w:ascii="Times New Roman" w:hAnsi="Times New Roman"/>
+          <w:sz w:val="17"/>
+        </w:rPr>
+        <w:t>TABLE VII</w:t>
+        <w:br/>
+        <w:t>PER-CATEGORY CALIBRATION RESIDUAL STD., MIN-MAX (9 CATEGORIES)</w:t>
+      </w:r>
+    </w:p>
+    <w:tbl>
+      <w:tblPr>
+        <w:tblStyle w:val="TableGrid"/>
+        <w:tblW w:type="auto" w:w="0"/>
+        <w:jc w:val="center"/>
+        <w:tblLayout w:type="fixed"/>
+        <w:tblLook w:firstColumn="1" w:firstRow="1" w:lastColumn="0" w:lastRow="0" w:noHBand="0" w:noVBand="1" w:val="04A0"/>
+      </w:tblPr>
+      <w:tblGrid>
+        <w:gridCol w:w="2520"/>
+        <w:gridCol w:w="2520"/>
+        <w:gridCol w:w="2520"/>
+        <w:gridCol w:w="2520"/>
+      </w:tblGrid>
+      <w:tr>
+        <w:tc>
+          <w:tcPr>
+            <w:tcW w:type="dxa" w:w="1080"/>
+            <w:shd w:fill="D9D9D9"/>
+          </w:tcPr>
+          <w:p>
+            <w:pPr>
+              <w:jc w:val="center"/>
+            </w:pPr>
+            <w:r>
+              <w:rPr>
+                <w:rFonts w:ascii="Times New Roman" w:hAnsi="Times New Roman"/>
+                <w:b/>
+                <w:sz w:val="15"/>
+              </w:rPr>
+              <w:t>Target</w:t>
+            </w:r>
+          </w:p>
+        </w:tc>
+        <w:tc>
+          <w:tcPr>
+            <w:tcW w:type="dxa" w:w="792"/>
+            <w:shd w:fill="D9D9D9"/>
+          </w:tcPr>
+          <w:p>
+            <w:pPr>
+              <w:jc w:val="center"/>
+            </w:pPr>
+            <w:r>
+              <w:rPr>
+                <w:rFonts w:ascii="Times New Roman" w:hAnsi="Times New Roman"/>
+                <w:b/>
+                <w:sz w:val="15"/>
+              </w:rPr>
+              <w:t>Min std</w:t>
+            </w:r>
+          </w:p>
+        </w:tc>
+        <w:tc>
+          <w:tcPr>
+            <w:tcW w:type="dxa" w:w="792"/>
+            <w:shd w:fill="D9D9D9"/>
+          </w:tcPr>
+          <w:p>
+            <w:pPr>
+              <w:jc w:val="center"/>
+            </w:pPr>
+            <w:r>
+              <w:rPr>
+                <w:rFonts w:ascii="Times New Roman" w:hAnsi="Times New Roman"/>
+                <w:b/>
+                <w:sz w:val="15"/>
+              </w:rPr>
+              <w:t>Max std</w:t>
+            </w:r>
+          </w:p>
+        </w:tc>
+        <w:tc>
+          <w:tcPr>
+            <w:tcW w:type="dxa" w:w="1080"/>
+            <w:shd w:fill="D9D9D9"/>
+          </w:tcPr>
+          <w:p>
+            <w:pPr>
+              <w:jc w:val="center"/>
+            </w:pPr>
+            <w:r>
+              <w:rPr>
+                <w:rFonts w:ascii="Times New Roman" w:hAnsi="Times New Roman"/>
+                <w:b/>
+                <w:sz w:val="15"/>
+              </w:rPr>
+              <w:t>Max/min ratio</w:t>
+            </w:r>
+          </w:p>
+        </w:tc>
+      </w:tr>
+      <w:tr>
+        <w:tc>
+          <w:tcPr>
+            <w:tcW w:type="dxa" w:w="1080"/>
+          </w:tcPr>
+          <w:p>
+            <w:pPr>
+              <w:jc w:val="left"/>
+            </w:pPr>
+            <w:r>
+              <w:rPr>
+                <w:rFonts w:ascii="Times New Roman" w:hAnsi="Times New Roman"/>
+                <w:sz w:val="15"/>
+              </w:rPr>
+              <w:t>n_patients</w:t>
+            </w:r>
+          </w:p>
+        </w:tc>
+        <w:tc>
+          <w:tcPr>
+            <w:tcW w:type="dxa" w:w="792"/>
+          </w:tcPr>
+          <w:p>
+            <w:pPr>
+              <w:jc w:val="center"/>
+            </w:pPr>
+            <w:r>
+              <w:rPr>
+                <w:rFonts w:ascii="Times New Roman" w:hAnsi="Times New Roman"/>
+                <w:sz w:val="15"/>
+              </w:rPr>
+              <w:t>5.1</w:t>
+            </w:r>
+          </w:p>
+        </w:tc>
+        <w:tc>
+          <w:tcPr>
+            <w:tcW w:type="dxa" w:w="792"/>
+          </w:tcPr>
+          <w:p>
+            <w:pPr>
+              <w:jc w:val="center"/>
+            </w:pPr>
+            <w:r>
+              <w:rPr>
+                <w:rFonts w:ascii="Times New Roman" w:hAnsi="Times New Roman"/>
+                <w:sz w:val="15"/>
+              </w:rPr>
+              <w:t>9.3</w:t>
+            </w:r>
+          </w:p>
+        </w:tc>
+        <w:tc>
+          <w:tcPr>
+            <w:tcW w:type="dxa" w:w="1080"/>
+          </w:tcPr>
+          <w:p>
+            <w:pPr>
+              <w:jc w:val="center"/>
+            </w:pPr>
+            <w:r>
+              <w:rPr>
+                <w:rFonts w:ascii="Times New Roman" w:hAnsi="Times New Roman"/>
+                <w:sz w:val="15"/>
+              </w:rPr>
+              <w:t>1.8x</w:t>
+            </w:r>
+          </w:p>
+        </w:tc>
+      </w:tr>
+      <w:tr>
+        <w:tc>
+          <w:tcPr>
+            <w:tcW w:type="dxa" w:w="1080"/>
+          </w:tcPr>
+          <w:p>
+            <w:pPr>
+              <w:jc w:val="left"/>
+            </w:pPr>
+            <w:r>
+              <w:rPr>
+                <w:rFonts w:ascii="Times New Roman" w:hAnsi="Times New Roman"/>
+                <w:sz w:val="15"/>
+              </w:rPr>
+              <w:t>mean_total</w:t>
+            </w:r>
+          </w:p>
+        </w:tc>
+        <w:tc>
+          <w:tcPr>
+            <w:tcW w:type="dxa" w:w="792"/>
+          </w:tcPr>
+          <w:p>
+            <w:pPr>
+              <w:jc w:val="center"/>
+            </w:pPr>
+            <w:r>
+              <w:rPr>
+                <w:rFonts w:ascii="Times New Roman" w:hAnsi="Times New Roman"/>
+                <w:sz w:val="15"/>
+              </w:rPr>
+              <w:t>2.8</w:t>
+            </w:r>
+          </w:p>
+        </w:tc>
+        <w:tc>
+          <w:tcPr>
+            <w:tcW w:type="dxa" w:w="792"/>
+          </w:tcPr>
+          <w:p>
+            <w:pPr>
+              <w:jc w:val="center"/>
+            </w:pPr>
+            <w:r>
+              <w:rPr>
+                <w:rFonts w:ascii="Times New Roman" w:hAnsi="Times New Roman"/>
+                <w:sz w:val="15"/>
+              </w:rPr>
+              <w:t>11.5</w:t>
+            </w:r>
+          </w:p>
+        </w:tc>
+        <w:tc>
+          <w:tcPr>
+            <w:tcW w:type="dxa" w:w="1080"/>
+          </w:tcPr>
+          <w:p>
+            <w:pPr>
+              <w:jc w:val="center"/>
+            </w:pPr>
+            <w:r>
+              <w:rPr>
+                <w:rFonts w:ascii="Times New Roman" w:hAnsi="Times New Roman"/>
+                <w:sz w:val="15"/>
+              </w:rPr>
+              <w:t>4.1x</w:t>
+            </w:r>
+          </w:p>
+        </w:tc>
+      </w:tr>
+      <w:tr>
+        <w:tc>
+          <w:tcPr>
+            <w:tcW w:type="dxa" w:w="1080"/>
+          </w:tcPr>
+          <w:p>
+            <w:pPr>
+              <w:jc w:val="left"/>
+            </w:pPr>
+            <w:r>
+              <w:rPr>
+                <w:rFonts w:ascii="Times New Roman" w:hAnsi="Times New Roman"/>
+                <w:sz w:val="15"/>
+              </w:rPr>
+              <w:t>mean_wait</w:t>
+            </w:r>
+          </w:p>
+        </w:tc>
+        <w:tc>
+          <w:tcPr>
+            <w:tcW w:type="dxa" w:w="792"/>
+          </w:tcPr>
+          <w:p>
+            <w:pPr>
+              <w:jc w:val="center"/>
+            </w:pPr>
+            <w:r>
+              <w:rPr>
+                <w:rFonts w:ascii="Times New Roman" w:hAnsi="Times New Roman"/>
+                <w:sz w:val="15"/>
+              </w:rPr>
+              <w:t>0.6</w:t>
+            </w:r>
+          </w:p>
+        </w:tc>
+        <w:tc>
+          <w:tcPr>
+            <w:tcW w:type="dxa" w:w="792"/>
+          </w:tcPr>
+          <w:p>
+            <w:pPr>
+              <w:jc w:val="center"/>
+            </w:pPr>
+            <w:r>
+              <w:rPr>
+                <w:rFonts w:ascii="Times New Roman" w:hAnsi="Times New Roman"/>
+                <w:sz w:val="15"/>
+              </w:rPr>
+              <w:t>12.0</w:t>
+            </w:r>
+          </w:p>
+        </w:tc>
+        <w:tc>
+          <w:tcPr>
+            <w:tcW w:type="dxa" w:w="1080"/>
+          </w:tcPr>
+          <w:p>
+            <w:pPr>
+              <w:jc w:val="center"/>
+            </w:pPr>
+            <w:r>
+              <w:rPr>
+                <w:rFonts w:ascii="Times New Roman" w:hAnsi="Times New Roman"/>
+                <w:sz w:val="15"/>
+              </w:rPr>
+              <w:t>19.1x</w:t>
+            </w:r>
+          </w:p>
+        </w:tc>
+      </w:tr>
+      <w:tr>
+        <w:tc>
+          <w:tcPr>
+            <w:tcW w:type="dxa" w:w="1080"/>
+          </w:tcPr>
+          <w:p>
+            <w:pPr>
+              <w:jc w:val="left"/>
+            </w:pPr>
+            <w:r>
+              <w:rPr>
+                <w:rFonts w:ascii="Times New Roman" w:hAnsi="Times New Roman"/>
+                <w:sz w:val="15"/>
+              </w:rPr>
+              <w:t>p95_wait</w:t>
+            </w:r>
+          </w:p>
+        </w:tc>
+        <w:tc>
+          <w:tcPr>
+            <w:tcW w:type="dxa" w:w="792"/>
+          </w:tcPr>
+          <w:p>
+            <w:pPr>
+              <w:jc w:val="center"/>
+            </w:pPr>
+            <w:r>
+              <w:rPr>
+                <w:rFonts w:ascii="Times New Roman" w:hAnsi="Times New Roman"/>
+                <w:sz w:val="15"/>
+              </w:rPr>
+              <w:t>4.8</w:t>
+            </w:r>
+          </w:p>
+        </w:tc>
+        <w:tc>
+          <w:tcPr>
+            <w:tcW w:type="dxa" w:w="792"/>
+          </w:tcPr>
+          <w:p>
+            <w:pPr>
+              <w:jc w:val="center"/>
+            </w:pPr>
+            <w:r>
+              <w:rPr>
+                <w:rFonts w:ascii="Times New Roman" w:hAnsi="Times New Roman"/>
+                <w:sz w:val="15"/>
+              </w:rPr>
+              <w:t>115.6</w:t>
+            </w:r>
+          </w:p>
+        </w:tc>
+        <w:tc>
+          <w:tcPr>
+            <w:tcW w:type="dxa" w:w="1080"/>
+          </w:tcPr>
+          <w:p>
+            <w:pPr>
+              <w:jc w:val="center"/>
+            </w:pPr>
+            <w:r>
+              <w:rPr>
+                <w:rFonts w:ascii="Times New Roman" w:hAnsi="Times New Roman"/>
+                <w:sz w:val="15"/>
+              </w:rPr>
+              <w:t>23.9x</w:t>
+            </w:r>
+          </w:p>
+        </w:tc>
+      </w:tr>
+    </w:tbl>
+    <w:p>
+      <w:pPr>
+        <w:spacing w:after="80"/>
+      </w:pPr>
+    </w:p>
+    <w:p>
+      <w:pPr>
+        <w:spacing w:after="120"/>
+        <w:jc w:val="both"/>
+      </w:pPr>
+      <w:r>
+        <w:rPr>
+          <w:rFonts w:ascii="Times New Roman" w:hAnsi="Times New Roman"/>
+          <w:sz w:val="20"/>
+        </w:rPr>
+        <w:t>The practical implication for a staffing decision-maker is direct: a marginal coverage number, however statistically valid, is the wrong number to trust when the decision at hand is specifically about the high-utilization regime where marginal coverage is least informative about that regime's own reliability.</w:t>
       </w:r>
     </w:p>
     <w:p>

</xml_diff>